<commit_message>
eazygleam.com.au — park content:init pending client intake forms (upgrade mode; content Meta File confirmed, 9 pages)
</commit_message>
<xml_diff>
--- a/clients/thecakepeople.au/Thecakepeople.au.docx
+++ b/clients/thecakepeople.au/Thecakepeople.au.docx
@@ -87,7 +87,7 @@
         <w:rPr>
           <w:rtl w:val="0"/>
         </w:rPr>
-        <w:t xml:space="preserve"> Barbie Cakes Melbourne, Doll Cakes | The Cake People</w:t>
+        <w:t xml:space="preserve"> Barbie Cakes Melbourne | The Cake People</w:t>
       </w:r>
     </w:p>
     <w:p>
@@ -595,7 +595,9 @@
     <w:p>
       <w:pPr>
         <w:spacing w:after="200" w:lineRule="auto"/>
-        <w:rPr/>
+        <w:rPr>
+          <w:color w:val="292a2e"/>
+        </w:rPr>
       </w:pPr>
       <w:r>
         <w:rPr>
@@ -608,12 +610,7 @@
           <w:color w:val="292a2e"/>
           <w:rtl w:val="0"/>
         </w:rPr>
-        <w:t xml:space="preserve">Please note: our cakes are made in a kitchen that handles nuts and may contain traces, however we can use nut-free and soy-free based recipes if there’s an allergy.</w:t>
-      </w:r>
-      <w:r>
-        <w:rPr>
-          <w:rtl w:val="0"/>
-        </w:rPr>
+        <w:t xml:space="preserve">Please note: our cakes are made in a kitchen that handles nuts and may contain traces, however we can use nut-free and soy-free based recipes if there’s an allergy. Please note: our cakes are made in a kitchen that handles nuts and may contain traces.</w:t>
       </w:r>
     </w:p>
     <w:p>
@@ -2246,7 +2243,30 @@
         <w:rPr>
           <w:rtl w:val="0"/>
         </w:rPr>
-        <w:t xml:space="preserve">Yes. The whole kitchen is plant-based, so every cake is egg-free and dairy-free by default, with nut-free and soy-free recipes on request, and one cake serves the whole grid.</w:t>
+        <w:t xml:space="preserve">Yes. The whole kitchen is plant-based, so every cake is egg-free and dairy-free by default, with nut-free and soy-free recipes available on request. </w:t>
+      </w:r>
+      <w:r>
+        <w:rPr>
+          <w:color w:val="292a2e"/>
+          <w:rtl w:val="0"/>
+        </w:rPr>
+        <w:t xml:space="preserve">Please note: our cakes are made in a kitchen that handles nuts and may contain traces.</w:t>
+      </w:r>
+      <w:r>
+        <w:rPr>
+          <w:rtl w:val="0"/>
+        </w:rPr>
+      </w:r>
+    </w:p>
+    <w:p>
+      <w:pPr>
+        <w:spacing w:after="200" w:lineRule="auto"/>
+        <w:rPr/>
+      </w:pPr>
+      <w:r>
+        <w:rPr>
+          <w:rtl w:val="0"/>
+        </w:rPr>
       </w:r>
     </w:p>
     <w:p>
@@ -3127,7 +3147,7 @@
         <w:rPr>
           <w:rtl w:val="0"/>
         </w:rPr>
-        <w:t xml:space="preserve"> Lightning McQueen Cakes Melbourne | Plant-Based | The Cake People</w:t>
+        <w:t xml:space="preserve"> Lightning McQueen Cakes Melbourne | The Cake People</w:t>
       </w:r>
     </w:p>
     <w:p>
@@ -3599,7 +3619,7 @@
         <w:rPr>
           <w:rtl w:val="0"/>
         </w:rPr>
-        <w:t xml:space="preserve">Please note, our cakes are gluten-friendly rather than coeliac-certified.</w:t>
+        <w:t xml:space="preserve">Please note, our cakes are gluten-friendly rather than coeliac-certified, as well as baked in a kitchen thast does use nuts and therefore may contain traces.</w:t>
       </w:r>
     </w:p>
     <w:p>
@@ -3926,7 +3946,7 @@
         <w:rPr>
           <w:rtl w:val="0"/>
         </w:rPr>
-        <w:t xml:space="preserve"> Messi Cakes Melbourne | Plant-Based | The Cake People</w:t>
+        <w:t xml:space="preserve"> Messi Cakes Melbourne | The Cake People</w:t>
       </w:r>
     </w:p>
     <w:p>
@@ -3946,7 +3966,7 @@
         <w:rPr>
           <w:rtl w:val="0"/>
         </w:rPr>
-        <w:t xml:space="preserve"> Football-themed Messi cakes made in Melbourne by an award-winning team. Edible-image and custom Inter Miami designs, delivered or </w:t>
+        <w:t xml:space="preserve"> Football-themed Messi cakes made in Melbourne by an award-winning team. Edible-image and custom designs, delivered or </w:t>
       </w:r>
       <w:r>
         <w:rPr>
@@ -4387,17 +4407,6 @@
     </w:p>
     <w:p>
       <w:pPr>
-        <w:spacing w:after="200" w:lineRule="auto"/>
-        <w:rPr/>
-      </w:pPr>
-      <w:r>
-        <w:rPr>
-          <w:rtl w:val="0"/>
-        </w:rPr>
-      </w:r>
-    </w:p>
-    <w:p>
-      <w:pPr>
         <w:pStyle w:val="Heading3"/>
         <w:keepNext w:val="0"/>
         <w:keepLines w:val="0"/>
@@ -4450,7 +4459,7 @@
         <w:rPr>
           <w:rtl w:val="0"/>
         </w:rPr>
-        <w:t xml:space="preserve">Yes. You can choose a pink Inter Miami kit, or upload a photo and we design around it.</w:t>
+        <w:t xml:space="preserve">Yes. You can upload a photo and we design around it.</w:t>
       </w:r>
     </w:p>
     <w:p>
@@ -4509,35 +4518,6 @@
           <w:rtl w:val="0"/>
         </w:rPr>
         <w:t xml:space="preserve">Absolutely. Messi is asked for most, but we make cakes for any player, club or a general soccer theme.</w:t>
-      </w:r>
-    </w:p>
-    <w:p>
-      <w:pPr>
-        <w:spacing w:after="200" w:lineRule="auto"/>
-        <w:rPr>
-          <w:b w:val="1"/>
-          <w:bCs w:val="1"/>
-        </w:rPr>
-      </w:pPr>
-      <w:r>
-        <w:rPr>
-          <w:b w:val="1"/>
-          <w:bCs w:val="1"/>
-          <w:rtl w:val="0"/>
-        </w:rPr>
-        <w:t xml:space="preserve">Is a football cake suitable for allergies?</w:t>
-      </w:r>
-    </w:p>
-    <w:p>
-      <w:pPr>
-        <w:spacing w:after="200" w:lineRule="auto"/>
-        <w:rPr/>
-      </w:pPr>
-      <w:r>
-        <w:rPr>
-          <w:rtl w:val="0"/>
-        </w:rPr>
-        <w:t xml:space="preserve">It is. Each cake leaves us free from egg, dairy, nut and soy, so vegan and allergy-aware guests are looked after without ordering anything separate.</w:t>
       </w:r>
     </w:p>
     <w:p>
@@ -4675,7 +4655,7 @@
         <w:rPr>
           <w:rtl w:val="0"/>
         </w:rPr>
-        <w:t xml:space="preserve"> Minecraft Cakes Melbourne | Plant-Based | The Cake People</w:t>
+        <w:t xml:space="preserve"> Minecraft Cakes Melbourne | The Cake People</w:t>
       </w:r>
     </w:p>
     <w:p>
@@ -5492,7 +5472,7 @@
         <w:rPr>
           <w:rtl w:val="0"/>
         </w:rPr>
-        <w:t xml:space="preserve"> Peppa Pig Cakes Melbourne | Plant-Based | The Cake People</w:t>
+        <w:t xml:space="preserve"> Peppa Pig Cakes Melbourne | The Cake People</w:t>
       </w:r>
     </w:p>
     <w:p>
@@ -6440,7 +6420,7 @@
         <w:rPr>
           <w:rtl w:val="0"/>
         </w:rPr>
-        <w:t xml:space="preserve"> Roblox Cakes Melbourne | Plant-Based | The Cake People</w:t>
+        <w:t xml:space="preserve"> Roblox Cakes Melbourne | The Cake People</w:t>
       </w:r>
     </w:p>
     <w:p>
@@ -6773,7 +6753,7 @@
         <w:rPr>
           <w:rtl w:val="0"/>
         </w:rPr>
-        <w:t xml:space="preserve"> a kids party requires considerable planning, and catering to different dietary requirements shouldn’t make the day more stressful than it needs to be. At The Cake People, every Roblox cake we make is 100% plant-based, egg-free and dairy-free come completely standard, and some cake recipes can be both nut-free and soy-free on request.</w:t>
+        <w:t xml:space="preserve"> a kids party requires considerable planning, and catering to different dietary requirements shouldn’t make the day more stressful than it needs to be. At The Cake People, every Roblox cake we make is 100% plant-based, egg-free and dairy-free come completely standard.</w:t>
       </w:r>
     </w:p>
     <w:p>
@@ -7840,7 +7820,7 @@
         <w:rPr>
           <w:rtl w:val="0"/>
         </w:rPr>
-        <w:t xml:space="preserve">Here is the part that quietly solves a lot of birthday headaches. Every cake we make is 100% plant-based, so it is egg-free and dairy-free before you even ask. We also bake nut-free and soy-free recipes, with gluten-friendly options.</w:t>
+        <w:t xml:space="preserve">Here is the part that quietly solves a lot of birthday headaches. Every cake we make is 100% plant-based, so it is egg-free and dairy-free before you even ask. </w:t>
       </w:r>
     </w:p>
     <w:p>
@@ -10893,7 +10873,7 @@
         <w:rPr>
           <w:rtl w:val="0"/>
         </w:rPr>
-        <w:t xml:space="preserve"> Celebrate with a custom Messi cake featuring your chosen image, personalised details and 100% plant-based ingredients, made in Melbourne.</w:t>
+        <w:t xml:space="preserve"> Celebrate with a custom Messi cake featuring your chosen image, personalised details, made in Melbourne.</w:t>
       </w:r>
     </w:p>
     <w:p>
@@ -12204,7 +12184,7 @@
         <w:rPr>
           <w:rtl w:val="0"/>
         </w:rPr>
-        <w:t xml:space="preserve"> Get your very own Roblox cake with a personalised name and age, handcrafted in Melbourne using 100% plant-based ingredients.</w:t>
+        <w:t xml:space="preserve"> Get your very own Roblox cake with a personalised name and age, handcrafted in Melbourne. Order now.</w:t>
       </w:r>
     </w:p>
     <w:p>
@@ -13361,7 +13341,7 @@
         <w:rPr>
           <w:rtl w:val="0"/>
         </w:rPr>
-        <w:t xml:space="preserve"> Custom Cakes Melbourne | Bespoke Plant-Based Design | The Cake People</w:t>
+        <w:t xml:space="preserve"> Custom Cakes Melbourne | The Cake People</w:t>
       </w:r>
     </w:p>
     <w:p>
@@ -13448,19 +13428,7 @@
         <w:rPr>
           <w:rtl w:val="0"/>
         </w:rPr>
-        <w:t xml:space="preserve">The Cake People is an award-winning, 100% plant-based kitchen designing custom cakes in Melbourne since 2014. You dream it, we make it happen. Build your order online for delivery right across the city, or swing by for collection from our Keilor Park kitchen. </w:t>
-      </w:r>
-    </w:p>
-    <w:p>
-      <w:pPr>
-        <w:spacing w:after="200" w:lineRule="auto"/>
-        <w:rPr/>
-      </w:pPr>
-      <w:r>
-        <w:rPr>
-          <w:rtl w:val="0"/>
-        </w:rPr>
-        <w:t xml:space="preserve">Not sure where to start? </w:t>
+        <w:t xml:space="preserve">The Cake People is an award-winning kitchen making custom edible image cakes in Melbourne since 2014. You dream it, we make it happen. Build your order online for delivery right across the city, or swing by for collection from our Keilor Park kitchen. </w:t>
       </w:r>
     </w:p>
     <w:p>
@@ -13513,7 +13481,7 @@
         <w:rPr>
           <w:rtl w:val="0"/>
         </w:rPr>
-        <w:t xml:space="preserve">All we need to get started is your idea. Tell us the occasion, send a photo, a colour palette, or a design you're obsessed with, and we'll build the cake around it. From there, you pick the flavour, the size, and all the little personal touches that make it truly yours: a name, an age, team colours, a party theme. </w:t>
+        <w:t xml:space="preserve">All we need to get started is your idea. Upload a photo or choose a design you're obsessed with, and we'll build the cake around it. From there, you pick the flavour, the size, and all the little personal touches that make it truly yours: a name, an age, team colours, a party theme. </w:t>
       </w:r>
     </w:p>
     <w:p>
@@ -13605,20 +13573,7 @@
         <w:rPr>
           <w:rtl w:val="0"/>
         </w:rPr>
-        <w:t xml:space="preserve">Every cake is100% plant-based, with no egg or dairy based ingredients. Some cakes can also be made nut-free, soy-free or gluten-friendly. </w:t>
-      </w:r>
-    </w:p>
-    <w:p>
-      <w:pPr>
-        <w:keepNext w:val="0"/>
-        <w:keepLines w:val="0"/>
-        <w:spacing w:before="280" w:lineRule="auto"/>
-        <w:rPr/>
-      </w:pPr>
-      <w:r>
-        <w:rPr>
-          <w:rtl w:val="0"/>
-        </w:rPr>
+        <w:t xml:space="preserve">Every cake is 100% plant-based, with no egg or dairy based ingredients. </w:t>
       </w:r>
     </w:p>
     <w:p>
@@ -14118,7 +14073,7 @@
         <w:rPr>
           <w:rtl w:val="0"/>
         </w:rPr>
-        <w:t xml:space="preserve"> Upload a photo, character or logo and we print it as an edible image cake in Melbourne. Order online form The Cake People today.</w:t>
+        <w:t xml:space="preserve"> Upload a photo, character or logo and we print it as an edible image cake in Melbourne. Order online from The Cake People today.</w:t>
       </w:r>
     </w:p>
     <w:p>
@@ -14157,18 +14112,6 @@
           <w:rtl w:val="0"/>
         </w:rPr>
         <w:t xml:space="preserve">You have already picked the picture. A photo of the birthday girl, her favourite character, or a logo for the office party. At The Cake People, getting that image onto an edible image cake in Melbourne is one of our most-loved jobs, with everything printed in-house on cakes that are 100% plant-based. </w:t>
-      </w:r>
-    </w:p>
-    <w:p>
-      <w:pPr>
-        <w:spacing w:after="200" w:lineRule="auto"/>
-        <w:rPr/>
-      </w:pPr>
-      <w:r>
-        <w:rPr>
-          <w:rtl w:val="0"/>
-        </w:rPr>
-        <w:t xml:space="preserve">Our kitchen is fully plant-based, egg-free and dairy-free come completely standard, making it easy to accommodate your guest list with one beautiful cake. </w:t>
       </w:r>
     </w:p>
     <w:p>
@@ -15576,6 +15519,18 @@
         </w:rPr>
         <w:t xml:space="preserve">here is no separate plant-based menu, because there is no other kind. Every cake is 100% plant-based from the first mix, so egg-free and dairy-free are simply how we bake, and nut-free and soy-free are built in for the guests who need them. </w:t>
       </w:r>
+      <w:r>
+        <w:rPr>
+          <w:color w:val="292a2e"/>
+          <w:rtl w:val="0"/>
+        </w:rPr>
+        <w:t xml:space="preserve">Please note: our cakes are made in a kitchen that handles nuts and may contain traces.</w:t>
+      </w:r>
+      <w:r>
+        <w:rPr>
+          <w:rtl w:val="0"/>
+        </w:rPr>
+      </w:r>
     </w:p>
     <w:p>
       <w:pPr>
@@ -15875,7 +15830,7 @@
         <w:rPr>
           <w:rtl w:val="0"/>
         </w:rPr>
-        <w:t xml:space="preserve"> Custom, personalised cupcakes in Melbourne, baked 100% plant-based and allergy-friendly. Order a box for delivery or click &amp; collect.</w:t>
+        <w:t xml:space="preserve"> Custom, personalised cupcakes in Melbourne. Order a box for delivery or click &amp; collect.</w:t>
       </w:r>
     </w:p>
     <w:p>
@@ -15925,31 +15880,19 @@
         <w:rPr>
           <w:rtl w:val="0"/>
         </w:rPr>
-        <w:t xml:space="preserve">At The Cake People, we’ve been answering those exact questions since 2014, baking premium cupcakes for Melbourne celebrations from our Keilor Park kitchen. Every single batch is 100% plant-based, meaning they are naturally egg-free and dairy-free from the very first mix. </w:t>
-      </w:r>
-    </w:p>
-    <w:p>
-      <w:pPr>
-        <w:spacing w:after="200" w:lineRule="auto"/>
-        <w:rPr/>
-      </w:pPr>
-      <w:r>
-        <w:rPr>
-          <w:rtl w:val="0"/>
-        </w:rPr>
-        <w:t xml:space="preserve">Whether you need a single dozen for the office, a personalised box for a birthday, or a massive, tiered party display, we make the process completely seamless. </w:t>
-      </w:r>
-    </w:p>
-    <w:p>
-      <w:pPr>
-        <w:spacing w:after="200" w:lineRule="auto"/>
-        <w:rPr/>
-      </w:pPr>
-      <w:r>
-        <w:rPr>
-          <w:rtl w:val="0"/>
-        </w:rPr>
-        <w:t xml:space="preserve">Order online for delivery in Melbourne, or collect it once your order is ready.</w:t>
+        <w:t xml:space="preserve">At The Cake People, we’ve been answering those exact questions since 2014, baking premium cupcakes for Melbourne celebrations from our Keilor Park kitchen. Whether you need a single dozen for the office, a personalised box for a birthday, or a massive, tiered party display, we make the process completely seamless. </w:t>
+      </w:r>
+    </w:p>
+    <w:p>
+      <w:pPr>
+        <w:spacing w:after="200" w:lineRule="auto"/>
+        <w:rPr/>
+      </w:pPr>
+      <w:r>
+        <w:rPr>
+          <w:rtl w:val="0"/>
+        </w:rPr>
+        <w:t xml:space="preserve">Order online for delivery across Melbourne!</w:t>
       </w:r>
     </w:p>
     <w:p>
@@ -16684,7 +16627,7 @@
         <w:rPr>
           <w:rtl w:val="0"/>
         </w:rPr>
-        <w:t xml:space="preserve"> Logo cupcakes in Melbourne for corporate events: your brand printed on award-winning, 100% plant-based cupcakes. Delivered or click &amp; collect.</w:t>
+        <w:t xml:space="preserve"> Logo cupcakes in Melbourne for corporate events: your brand printed on award-winning, plant-based cupcakes. Delivered or click &amp; collect.</w:t>
       </w:r>
     </w:p>
     <w:p>
@@ -16986,7 +16929,19 @@
         <w:rPr>
           <w:rtl w:val="0"/>
         </w:rPr>
-        <w:t xml:space="preserve">Because every cupcake we bake is 100% plant-based, one branded order already suits plant-based, egg-free and dairy-free colleagues, with some nut-free and soy-free options also available.</w:t>
+        <w:t xml:space="preserve">Because every cupcake we bake is 100% plant-based, one branded order already suits plant-based, egg-free and dairy-free colleagues, with some nut-free and soy-free options also available. </w:t>
+      </w:r>
+      <w:r>
+        <w:rPr>
+          <w:color w:val="292a2e"/>
+          <w:rtl w:val="0"/>
+        </w:rPr>
+        <w:t xml:space="preserve">Please note: our cakes are made in a kitchen that handles nuts and may contain traces.</w:t>
+      </w:r>
+      <w:r>
+        <w:rPr>
+          <w:rtl w:val="0"/>
+        </w:rPr>
       </w:r>
     </w:p>
     <w:p>
@@ -17692,19 +17647,31 @@
           <w:bCs w:val="1"/>
           <w:rtl w:val="0"/>
         </w:rPr>
-        <w:t xml:space="preserve">Are your gluten-friendly cupcakes vegan as well?</w:t>
-      </w:r>
-    </w:p>
-    <w:p>
-      <w:pPr>
-        <w:spacing w:after="200" w:lineRule="auto"/>
-        <w:rPr/>
-      </w:pPr>
-      <w:r>
-        <w:rPr>
-          <w:rtl w:val="0"/>
-        </w:rPr>
-        <w:t xml:space="preserve">Yes. Every cupcake we bake is 100% plant-based, so the gluten-friendly ones are egg-free and dairy-free too, and nut-free or soy-free recipes can be arranged.</w:t>
+        <w:t xml:space="preserve">Are your gluten-friendly cupcakes vegan-friendly as well?</w:t>
+      </w:r>
+    </w:p>
+    <w:p>
+      <w:pPr>
+        <w:spacing w:after="200" w:lineRule="auto"/>
+        <w:rPr/>
+      </w:pPr>
+      <w:r>
+        <w:rPr>
+          <w:rtl w:val="0"/>
+        </w:rPr>
+        <w:t xml:space="preserve">Yes. Every cupcake we bake is 100% plant-based, so the gluten-friendly ones are egg-free and dairy-free too, and nut-free or soy-free recipes can be arranged. </w:t>
+      </w:r>
+      <w:r>
+        <w:rPr>
+          <w:color w:val="292a2e"/>
+          <w:rtl w:val="0"/>
+        </w:rPr>
+        <w:t xml:space="preserve">Please note: our cakes are made in a kitchen that handles nuts and may contain traces.</w:t>
+      </w:r>
+      <w:r>
+        <w:rPr>
+          <w:rtl w:val="0"/>
+        </w:rPr>
       </w:r>
     </w:p>
     <w:p>
@@ -17900,7 +17867,7 @@
         <w:rPr>
           <w:rtl w:val="0"/>
         </w:rPr>
-        <w:t xml:space="preserve">When a cupcake is only labelled as plant-based, you can still end up wondering what is actually in it or if there’s been any cross-contamination. There is none of that here. The Cake People bake nothing but plant-based, so every cupcake that leaves our Melbourne kitchen is 100% plant-based, made entirely from wholesome, animal-free ingredients.</w:t>
+        <w:t xml:space="preserve">The Cake People bake nothing but plant-based creatins, so every cupcake that leaves our Melbourne kitchen is 100% plant-based, made entirely from wholesome, animal-free ingredients.</w:t>
       </w:r>
     </w:p>
     <w:p>
@@ -18219,13 +18186,30 @@
     </w:p>
     <w:p>
       <w:pPr>
+        <w:spacing w:after="200" w:lineRule="auto"/>
+        <w:rPr/>
+      </w:pPr>
+      <w:r>
+        <w:rPr>
+          <w:rtl w:val="0"/>
+        </w:rPr>
+      </w:r>
+    </w:p>
+    <w:p>
+      <w:pPr>
         <w:pStyle w:val="Heading3"/>
         <w:keepNext w:val="0"/>
         <w:keepLines w:val="0"/>
         <w:spacing w:before="280" w:lineRule="auto"/>
-        <w:rPr/>
-      </w:pPr>
-      <w:bookmarkStart w:colFirst="0" w:colLast="0" w:name="_5yeekrb0wfpe" w:id="168"/>
+        <w:rPr>
+          <w:b w:val="1"/>
+          <w:bCs w:val="1"/>
+          <w:color w:val="000000"/>
+          <w:sz w:val="26"/>
+          <w:szCs w:val="26"/>
+        </w:rPr>
+      </w:pPr>
+      <w:bookmarkStart w:colFirst="0" w:colLast="0" w:name="_7a1pc1jbkqbl" w:id="168"/>
       <w:bookmarkEnd w:id="168"/>
       <w:r>
         <w:rPr>
@@ -18236,24 +18220,94 @@
           <w:szCs w:val="26"/>
           <w:rtl w:val="0"/>
         </w:rPr>
-        <w:t xml:space="preserve">Plant-based, and friendly to other diets and allergens</w:t>
-      </w:r>
-      <w:r>
-        <w:rPr>
-          <w:rtl w:val="0"/>
-        </w:rPr>
-      </w:r>
-    </w:p>
-    <w:p>
-      <w:pPr>
-        <w:spacing w:after="200" w:lineRule="auto"/>
-        <w:rPr/>
-      </w:pPr>
-      <w:r>
-        <w:rPr>
-          <w:rtl w:val="0"/>
-        </w:rPr>
-        <w:t xml:space="preserve">At The Cake People, we operate a fully plant-based kitchen. So every cupcake we bake is 100% egg-free and dairy-free as standard, with recipes that also cater for nut-free, soy-free, and gluten-friendly options. </w:t>
+        <w:t xml:space="preserve">Plant-based cupcake questions, answered</w:t>
+      </w:r>
+    </w:p>
+    <w:p>
+      <w:pPr>
+        <w:spacing w:after="200" w:lineRule="auto"/>
+        <w:rPr>
+          <w:b w:val="1"/>
+          <w:bCs w:val="1"/>
+        </w:rPr>
+      </w:pPr>
+      <w:r>
+        <w:rPr>
+          <w:b w:val="1"/>
+          <w:bCs w:val="1"/>
+          <w:rtl w:val="0"/>
+        </w:rPr>
+        <w:t xml:space="preserve">Are your cupcakes suitable for a strict plant-based diet?</w:t>
+      </w:r>
+    </w:p>
+    <w:p>
+      <w:pPr>
+        <w:spacing w:after="200" w:lineRule="auto"/>
+        <w:rPr/>
+      </w:pPr>
+      <w:r>
+        <w:rPr>
+          <w:rtl w:val="0"/>
+        </w:rPr>
+        <w:t xml:space="preserve">They are. Every recipe we bake is fully plant-based, made without egg, dairy or any animal ingredient, so the whole range works for those on a strict plant-based diet or those with certain dietary requirements. </w:t>
+      </w:r>
+    </w:p>
+    <w:p>
+      <w:pPr>
+        <w:spacing w:after="200" w:lineRule="auto"/>
+        <w:rPr>
+          <w:b w:val="1"/>
+          <w:bCs w:val="1"/>
+        </w:rPr>
+      </w:pPr>
+      <w:r>
+        <w:rPr>
+          <w:b w:val="1"/>
+          <w:bCs w:val="1"/>
+          <w:rtl w:val="0"/>
+        </w:rPr>
+        <w:t xml:space="preserve">Do you deliver vegan cupcakes to the Melbourne CBD?</w:t>
+      </w:r>
+    </w:p>
+    <w:p>
+      <w:pPr>
+        <w:spacing w:after="200" w:lineRule="auto"/>
+        <w:rPr/>
+      </w:pPr>
+      <w:r>
+        <w:rPr>
+          <w:rtl w:val="0"/>
+        </w:rPr>
+        <w:t xml:space="preserve">Yes, delivery reaches the CBD and the wider metro. If you are closer to us, a pickup runs from our Keilor Park kitchen.</w:t>
+      </w:r>
+    </w:p>
+    <w:p>
+      <w:pPr>
+        <w:spacing w:after="200" w:lineRule="auto"/>
+        <w:rPr>
+          <w:b w:val="1"/>
+          <w:bCs w:val="1"/>
+        </w:rPr>
+      </w:pPr>
+      <w:r>
+        <w:rPr>
+          <w:b w:val="1"/>
+          <w:bCs w:val="1"/>
+          <w:rtl w:val="0"/>
+        </w:rPr>
+        <w:t xml:space="preserve">How much is a box of plant-based cupcakes?</w:t>
+      </w:r>
+    </w:p>
+    <w:p>
+      <w:pPr>
+        <w:spacing w:after="200" w:lineRule="auto"/>
+        <w:rPr/>
+      </w:pPr>
+      <w:r>
+        <w:rPr>
+          <w:rtl w:val="0"/>
+        </w:rPr>
+        <w:t xml:space="preserve">It depends on how many you need, the flavours and any personalising, but the cost will always be displayed when you order online.</w:t>
       </w:r>
     </w:p>
     <w:p>
@@ -18281,134 +18335,8 @@
           <w:szCs w:val="26"/>
         </w:rPr>
       </w:pPr>
-      <w:bookmarkStart w:colFirst="0" w:colLast="0" w:name="_7a1pc1jbkqbl" w:id="169"/>
+      <w:bookmarkStart w:colFirst="0" w:colLast="0" w:name="_aqqa206w621u" w:id="169"/>
       <w:bookmarkEnd w:id="169"/>
-      <w:r>
-        <w:rPr>
-          <w:b w:val="1"/>
-          <w:bCs w:val="1"/>
-          <w:color w:val="000000"/>
-          <w:sz w:val="26"/>
-          <w:szCs w:val="26"/>
-          <w:rtl w:val="0"/>
-        </w:rPr>
-        <w:t xml:space="preserve">Plant-based cupcake questions, answered</w:t>
-      </w:r>
-    </w:p>
-    <w:p>
-      <w:pPr>
-        <w:spacing w:after="200" w:lineRule="auto"/>
-        <w:rPr>
-          <w:b w:val="1"/>
-          <w:bCs w:val="1"/>
-        </w:rPr>
-      </w:pPr>
-      <w:r>
-        <w:rPr>
-          <w:b w:val="1"/>
-          <w:bCs w:val="1"/>
-          <w:rtl w:val="0"/>
-        </w:rPr>
-        <w:t xml:space="preserve">Are your cupcakes suitable for a strict plant-based diet?</w:t>
-      </w:r>
-    </w:p>
-    <w:p>
-      <w:pPr>
-        <w:spacing w:after="200" w:lineRule="auto"/>
-        <w:rPr/>
-      </w:pPr>
-      <w:r>
-        <w:rPr>
-          <w:rtl w:val="0"/>
-        </w:rPr>
-        <w:t xml:space="preserve">They are. Every recipe we bake is fully plant-based, made without egg, dairy or any animal ingredient, so the whole range works for those on a strict plant-based diet or those with certain dietary requirements. </w:t>
-      </w:r>
-    </w:p>
-    <w:p>
-      <w:pPr>
-        <w:spacing w:after="200" w:lineRule="auto"/>
-        <w:rPr>
-          <w:b w:val="1"/>
-          <w:bCs w:val="1"/>
-        </w:rPr>
-      </w:pPr>
-      <w:r>
-        <w:rPr>
-          <w:b w:val="1"/>
-          <w:bCs w:val="1"/>
-          <w:rtl w:val="0"/>
-        </w:rPr>
-        <w:t xml:space="preserve">Do you deliver vegan cupcakes to the Melbourne CBD?</w:t>
-      </w:r>
-    </w:p>
-    <w:p>
-      <w:pPr>
-        <w:spacing w:after="200" w:lineRule="auto"/>
-        <w:rPr/>
-      </w:pPr>
-      <w:r>
-        <w:rPr>
-          <w:rtl w:val="0"/>
-        </w:rPr>
-        <w:t xml:space="preserve">Yes, delivery reaches the CBD and the wider metro. If you are closer to us, a pickup runs from our Keilor Park kitchen.</w:t>
-      </w:r>
-    </w:p>
-    <w:p>
-      <w:pPr>
-        <w:spacing w:after="200" w:lineRule="auto"/>
-        <w:rPr>
-          <w:b w:val="1"/>
-          <w:bCs w:val="1"/>
-        </w:rPr>
-      </w:pPr>
-      <w:r>
-        <w:rPr>
-          <w:b w:val="1"/>
-          <w:bCs w:val="1"/>
-          <w:rtl w:val="0"/>
-        </w:rPr>
-        <w:t xml:space="preserve">How much is a box of plant-based cupcakes?</w:t>
-      </w:r>
-    </w:p>
-    <w:p>
-      <w:pPr>
-        <w:spacing w:after="200" w:lineRule="auto"/>
-        <w:rPr/>
-      </w:pPr>
-      <w:r>
-        <w:rPr>
-          <w:rtl w:val="0"/>
-        </w:rPr>
-        <w:t xml:space="preserve">It depends on how many you need, the flavours and any personalising, but the cost will always be displayed when you order online.</w:t>
-      </w:r>
-    </w:p>
-    <w:p>
-      <w:pPr>
-        <w:spacing w:after="200" w:lineRule="auto"/>
-        <w:rPr/>
-      </w:pPr>
-      <w:r>
-        <w:rPr>
-          <w:rtl w:val="0"/>
-        </w:rPr>
-      </w:r>
-    </w:p>
-    <w:p>
-      <w:pPr>
-        <w:pStyle w:val="Heading3"/>
-        <w:keepNext w:val="0"/>
-        <w:keepLines w:val="0"/>
-        <w:spacing w:before="280" w:lineRule="auto"/>
-        <w:rPr>
-          <w:b w:val="1"/>
-          <w:bCs w:val="1"/>
-          <w:color w:val="000000"/>
-          <w:sz w:val="26"/>
-          <w:szCs w:val="26"/>
-        </w:rPr>
-      </w:pPr>
-      <w:bookmarkStart w:colFirst="0" w:colLast="0" w:name="_aqqa206w621u" w:id="170"/>
-      <w:bookmarkEnd w:id="170"/>
       <w:r>
         <w:rPr>
           <w:b w:val="1"/>
@@ -18475,8 +18403,8 @@
           <w:bCs w:val="1"/>
         </w:rPr>
       </w:pPr>
-      <w:bookmarkStart w:colFirst="0" w:colLast="0" w:name="_tqfeir7jjqui" w:id="171"/>
-      <w:bookmarkEnd w:id="171"/>
+      <w:bookmarkStart w:colFirst="0" w:colLast="0" w:name="_tqfeir7jjqui" w:id="170"/>
+      <w:bookmarkEnd w:id="170"/>
       <w:r>
         <w:br w:type="page"/>
       </w:r>
@@ -18499,8 +18427,8 @@
           <w:szCs w:val="46"/>
         </w:rPr>
       </w:pPr>
-      <w:bookmarkStart w:colFirst="0" w:colLast="0" w:name="_58b99rmgozre" w:id="172"/>
-      <w:bookmarkEnd w:id="172"/>
+      <w:bookmarkStart w:colFirst="0" w:colLast="0" w:name="_58b99rmgozre" w:id="171"/>
+      <w:bookmarkEnd w:id="171"/>
       <w:r>
         <w:rPr>
           <w:b w:val="1"/>
@@ -18614,8 +18542,8 @@
           <w:szCs w:val="34"/>
         </w:rPr>
       </w:pPr>
-      <w:bookmarkStart w:colFirst="0" w:colLast="0" w:name="_jp3zb33pll55" w:id="173"/>
-      <w:bookmarkEnd w:id="173"/>
+      <w:bookmarkStart w:colFirst="0" w:colLast="0" w:name="_jp3zb33pll55" w:id="172"/>
+      <w:bookmarkEnd w:id="172"/>
       <w:r>
         <w:rPr>
           <w:b w:val="1"/>
@@ -18688,8 +18616,8 @@
           <w:szCs w:val="26"/>
         </w:rPr>
       </w:pPr>
-      <w:bookmarkStart w:colFirst="0" w:colLast="0" w:name="_bfrkg6psh32p" w:id="174"/>
-      <w:bookmarkEnd w:id="174"/>
+      <w:bookmarkStart w:colFirst="0" w:colLast="0" w:name="_bfrkg6psh32p" w:id="173"/>
+      <w:bookmarkEnd w:id="173"/>
       <w:r>
         <w:rPr>
           <w:b w:val="1"/>
@@ -19066,8 +18994,8 @@
           <w:szCs w:val="26"/>
         </w:rPr>
       </w:pPr>
-      <w:bookmarkStart w:colFirst="0" w:colLast="0" w:name="_pwwjurlov28w" w:id="175"/>
-      <w:bookmarkEnd w:id="175"/>
+      <w:bookmarkStart w:colFirst="0" w:colLast="0" w:name="_pwwjurlov28w" w:id="174"/>
+      <w:bookmarkEnd w:id="174"/>
       <w:r>
         <w:rPr>
           <w:b w:val="1"/>
@@ -19181,8 +19109,8 @@
           <w:szCs w:val="26"/>
         </w:rPr>
       </w:pPr>
-      <w:bookmarkStart w:colFirst="0" w:colLast="0" w:name="_sw85d2l8pyjh" w:id="176"/>
-      <w:bookmarkEnd w:id="176"/>
+      <w:bookmarkStart w:colFirst="0" w:colLast="0" w:name="_sw85d2l8pyjh" w:id="175"/>
+      <w:bookmarkEnd w:id="175"/>
       <w:r>
         <w:rPr>
           <w:rtl w:val="0"/>
@@ -19225,8 +19153,8 @@
           <w:bCs w:val="1"/>
         </w:rPr>
       </w:pPr>
-      <w:bookmarkStart w:colFirst="0" w:colLast="0" w:name="_6ilk15y8u4lh" w:id="177"/>
-      <w:bookmarkEnd w:id="177"/>
+      <w:bookmarkStart w:colFirst="0" w:colLast="0" w:name="_6ilk15y8u4lh" w:id="176"/>
+      <w:bookmarkEnd w:id="176"/>
       <w:r>
         <w:rPr>
           <w:b w:val="1"/>
@@ -19299,7 +19227,7 @@
         <w:rPr>
           <w:rtl w:val="0"/>
         </w:rPr>
-        <w:t xml:space="preserve"> Gluten-friendly Cakes Melbourne | Plant-Based | The Cake People</w:t>
+        <w:t xml:space="preserve"> Gluten-friendly Cakes Melbourne | The Cake People</w:t>
       </w:r>
     </w:p>
     <w:p>
@@ -19335,8 +19263,8 @@
           <w:szCs w:val="34"/>
         </w:rPr>
       </w:pPr>
-      <w:bookmarkStart w:colFirst="0" w:colLast="0" w:name="_zalzk69j3fob" w:id="178"/>
-      <w:bookmarkEnd w:id="178"/>
+      <w:bookmarkStart w:colFirst="0" w:colLast="0" w:name="_zalzk69j3fob" w:id="177"/>
+      <w:bookmarkEnd w:id="177"/>
       <w:r>
         <w:rPr>
           <w:b w:val="1"/>
@@ -19397,8 +19325,8 @@
         <w:spacing w:before="280" w:lineRule="auto"/>
         <w:rPr/>
       </w:pPr>
-      <w:bookmarkStart w:colFirst="0" w:colLast="0" w:name="_owf4f15g7nnc" w:id="179"/>
-      <w:bookmarkEnd w:id="179"/>
+      <w:bookmarkStart w:colFirst="0" w:colLast="0" w:name="_owf4f15g7nnc" w:id="178"/>
+      <w:bookmarkEnd w:id="178"/>
       <w:r>
         <w:rPr>
           <w:b w:val="1"/>
@@ -19485,8 +19413,8 @@
         <w:spacing w:before="280" w:lineRule="auto"/>
         <w:rPr/>
       </w:pPr>
-      <w:bookmarkStart w:colFirst="0" w:colLast="0" w:name="_o2wueea44rzu" w:id="180"/>
-      <w:bookmarkEnd w:id="180"/>
+      <w:bookmarkStart w:colFirst="0" w:colLast="0" w:name="_o2wueea44rzu" w:id="179"/>
+      <w:bookmarkEnd w:id="179"/>
       <w:r>
         <w:rPr>
           <w:b w:val="1"/>
@@ -19702,8 +19630,8 @@
           <w:szCs w:val="26"/>
         </w:rPr>
       </w:pPr>
-      <w:bookmarkStart w:colFirst="0" w:colLast="0" w:name="_q4ptvzhehwo8" w:id="181"/>
-      <w:bookmarkEnd w:id="181"/>
+      <w:bookmarkStart w:colFirst="0" w:colLast="0" w:name="_q4ptvzhehwo8" w:id="180"/>
+      <w:bookmarkEnd w:id="180"/>
       <w:r>
         <w:rPr>
           <w:b w:val="1"/>
@@ -19849,8 +19777,8 @@
           <w:szCs w:val="26"/>
         </w:rPr>
       </w:pPr>
-      <w:bookmarkStart w:colFirst="0" w:colLast="0" w:name="_j075jeqgvwa2" w:id="182"/>
-      <w:bookmarkEnd w:id="182"/>
+      <w:bookmarkStart w:colFirst="0" w:colLast="0" w:name="_j075jeqgvwa2" w:id="181"/>
+      <w:bookmarkEnd w:id="181"/>
       <w:r>
         <w:rPr>
           <w:b w:val="1"/>
@@ -19982,7 +19910,7 @@
         <w:rPr>
           <w:rtl w:val="0"/>
         </w:rPr>
-        <w:t xml:space="preserve">Yes. Because the whole kitchen is plant-based, egg-free and dairy-free come as standard on every cake, gluten-friendly ones included. Many can also be made nut-free or soy-free. </w:t>
+        <w:t xml:space="preserve">Yes. Because the whole kitchen is plant-based, egg-free and dairy-free come as standard on every cake, gluten-friendly ones included. </w:t>
       </w:r>
     </w:p>
     <w:p>
@@ -20045,8 +19973,8 @@
           <w:szCs w:val="46"/>
         </w:rPr>
       </w:pPr>
-      <w:bookmarkStart w:colFirst="0" w:colLast="0" w:name="_xslcqhf9bszj" w:id="183"/>
-      <w:bookmarkEnd w:id="183"/>
+      <w:bookmarkStart w:colFirst="0" w:colLast="0" w:name="_xslcqhf9bszj" w:id="182"/>
+      <w:bookmarkEnd w:id="182"/>
       <w:r>
         <w:br w:type="page"/>
       </w:r>
@@ -20067,8 +19995,8 @@
           <w:bCs w:val="1"/>
         </w:rPr>
       </w:pPr>
-      <w:bookmarkStart w:colFirst="0" w:colLast="0" w:name="_m5prbmhc1rzc" w:id="184"/>
-      <w:bookmarkEnd w:id="184"/>
+      <w:bookmarkStart w:colFirst="0" w:colLast="0" w:name="_m5prbmhc1rzc" w:id="183"/>
+      <w:bookmarkEnd w:id="183"/>
       <w:r>
         <w:rPr>
           <w:b w:val="1"/>
@@ -20121,7 +20049,7 @@
         <w:rPr>
           <w:rtl w:val="0"/>
         </w:rPr>
-        <w:t xml:space="preserve">Supporting keywords: sugar-free birthday cake, low sugar cake, no refined sugar, sugar-free celebration, reduced sugar cake, healthy birthday cake, sweetener cake</w:t>
+        <w:t xml:space="preserve">Supporting keywords: sugar-free birthday cake, low sugar cake, no refined sugar, sugar-free celebration, sweetener cake</w:t>
       </w:r>
     </w:p>
     <w:p>
@@ -20141,7 +20069,7 @@
         <w:rPr>
           <w:rtl w:val="0"/>
         </w:rPr>
-        <w:t xml:space="preserve"> Sugar-free Cakes Melbourne, No Refined Sugar | The Cake People</w:t>
+        <w:t xml:space="preserve"> Sugar-free Cakes Melbourne | The Cake People</w:t>
       </w:r>
     </w:p>
     <w:p>
@@ -20161,7 +20089,7 @@
         <w:rPr>
           <w:rtl w:val="0"/>
         </w:rPr>
-        <w:t xml:space="preserve"> Sugar-free cakes in Melbourne, baked with no refined sugar. Award-winning plant-based recipes, delivered or ready for collection.</w:t>
+        <w:t xml:space="preserve"> Sugar-free cakes in Melbourne. Award-winning plant-based recipes, delivered or ready for collection.</w:t>
       </w:r>
     </w:p>
     <w:p>
@@ -20177,8 +20105,8 @@
           <w:szCs w:val="34"/>
         </w:rPr>
       </w:pPr>
-      <w:bookmarkStart w:colFirst="0" w:colLast="0" w:name="_ef131mtdjsh9" w:id="185"/>
-      <w:bookmarkEnd w:id="185"/>
+      <w:bookmarkStart w:colFirst="0" w:colLast="0" w:name="_ef131mtdjsh9" w:id="184"/>
+      <w:bookmarkEnd w:id="184"/>
       <w:r>
         <w:rPr>
           <w:b w:val="1"/>
@@ -20239,8 +20167,8 @@
           <w:szCs w:val="26"/>
         </w:rPr>
       </w:pPr>
-      <w:bookmarkStart w:colFirst="0" w:colLast="0" w:name="_1zk6dn3lmu1n" w:id="186"/>
-      <w:bookmarkEnd w:id="186"/>
+      <w:bookmarkStart w:colFirst="0" w:colLast="0" w:name="_1zk6dn3lmu1n" w:id="185"/>
+      <w:bookmarkEnd w:id="185"/>
       <w:r>
         <w:rPr>
           <w:b w:val="1"/>
@@ -20294,33 +20222,87 @@
         </w:rPr>
         <w:t xml:space="preserve"> </w:t>
       </w:r>
-      <w:r>
-        <w:rPr>
-          <w:rtl w:val="0"/>
-        </w:rPr>
-        <w:t xml:space="preserve">Please note that the sugar free range is sweetened with xylitol, which is toxic to dogs. Once the cake arrives, please keep it well away from your pet.</w:t>
-      </w:r>
-    </w:p>
-    <w:p>
-      <w:pPr>
-        <w:rPr/>
-      </w:pPr>
-      <w:r>
-        <w:rPr>
-          <w:rtl w:val="0"/>
-        </w:rPr>
-      </w:r>
-    </w:p>
-    <w:p>
-      <w:pPr>
-        <w:spacing w:after="200" w:lineRule="auto"/>
-        <w:rPr/>
+    </w:p>
+    <w:p>
+      <w:pPr>
+        <w:rPr/>
+      </w:pPr>
+      <w:r>
+        <w:rPr>
+          <w:rtl w:val="0"/>
+        </w:rPr>
+      </w:r>
+    </w:p>
+    <w:p>
+      <w:pPr>
+        <w:rPr>
+          <w:color w:val="292a2e"/>
+        </w:rPr>
       </w:pPr>
       <w:r>
         <w:rPr>
           <w:rtl w:val="0"/>
         </w:rPr>
         <w:t xml:space="preserve">Because every cake comes from the 100% plant-based kitchen Joanne and Stephen have run since 2014, egg-free and dairy-free are standard here too. </w:t>
+      </w:r>
+      <w:r>
+        <w:rPr>
+          <w:color w:val="292a2e"/>
+          <w:rtl w:val="0"/>
+        </w:rPr>
+        <w:t xml:space="preserve">Please note: our cakes are made in a kitchen that handles nuts and may contain traces.</w:t>
+      </w:r>
+    </w:p>
+    <w:p>
+      <w:pPr>
+        <w:rPr>
+          <w:color w:val="292a2e"/>
+        </w:rPr>
+      </w:pPr>
+      <w:r>
+        <w:rPr>
+          <w:rtl w:val="0"/>
+        </w:rPr>
+      </w:r>
+    </w:p>
+    <w:p>
+      <w:pPr>
+        <w:rPr>
+          <w:b w:val="1"/>
+          <w:bCs w:val="1"/>
+        </w:rPr>
+      </w:pPr>
+      <w:r>
+        <w:rPr>
+          <w:rtl w:val="0"/>
+        </w:rPr>
+        <w:t xml:space="preserve">Disclaimer: </w:t>
+      </w:r>
+      <w:r>
+        <w:rPr>
+          <w:b w:val="1"/>
+          <w:bCs w:val="1"/>
+          <w:rtl w:val="0"/>
+        </w:rPr>
+        <w:t xml:space="preserve">Th</w:t>
+      </w:r>
+      <w:r>
+        <w:rPr>
+          <w:b w:val="1"/>
+          <w:bCs w:val="1"/>
+          <w:rtl w:val="0"/>
+        </w:rPr>
+        <w:t xml:space="preserve">e sugar free range is sweetened with xylitol, which is toxic to dogs. Once the cake arrives, please keep it well away from your pet.</w:t>
+      </w:r>
+    </w:p>
+    <w:p>
+      <w:pPr>
+        <w:rPr/>
+      </w:pPr>
+      <w:r>
+        <w:rPr>
+          <w:rtl w:val="0"/>
+        </w:rPr>
       </w:r>
     </w:p>
     <w:p>
@@ -20348,8 +20330,8 @@
           <w:szCs w:val="26"/>
         </w:rPr>
       </w:pPr>
-      <w:bookmarkStart w:colFirst="0" w:colLast="0" w:name="_65pjcfseht2b" w:id="187"/>
-      <w:bookmarkEnd w:id="187"/>
+      <w:bookmarkStart w:colFirst="0" w:colLast="0" w:name="_65pjcfseht2b" w:id="186"/>
+      <w:bookmarkEnd w:id="186"/>
       <w:r>
         <w:rPr>
           <w:b w:val="1"/>
@@ -20548,8 +20530,8 @@
           <w:szCs w:val="26"/>
         </w:rPr>
       </w:pPr>
-      <w:bookmarkStart w:colFirst="0" w:colLast="0" w:name="_feav29j7k6k3" w:id="188"/>
-      <w:bookmarkEnd w:id="188"/>
+      <w:bookmarkStart w:colFirst="0" w:colLast="0" w:name="_feav29j7k6k3" w:id="187"/>
+      <w:bookmarkEnd w:id="187"/>
       <w:r>
         <w:rPr>
           <w:b w:val="1"/>
@@ -20583,7 +20565,7 @@
         <w:rPr>
           <w:rtl w:val="0"/>
         </w:rPr>
-        <w:t xml:space="preserve">We have taken home awards in three consecutive years in 2024, 2025 and 2026. Across more than 8,000 orders, the reaction we hear most is surprise that less sugar can taste like this. </w:t>
+        <w:t xml:space="preserve">We have taken home awards in three consecutive years in 2024, 2025 and 2026. Across more than 8,000 orders, the reaction we hear most is surprise that a cake without sugar can taste like this. </w:t>
       </w:r>
     </w:p>
     <w:p>
@@ -20603,16 +20585,10 @@
         <w:keepNext w:val="0"/>
         <w:keepLines w:val="0"/>
         <w:spacing w:before="280" w:lineRule="auto"/>
-        <w:rPr>
-          <w:b w:val="1"/>
-          <w:bCs w:val="1"/>
-          <w:color w:val="000000"/>
-          <w:sz w:val="26"/>
-          <w:szCs w:val="26"/>
-        </w:rPr>
-      </w:pPr>
-      <w:bookmarkStart w:colFirst="0" w:colLast="0" w:name="_rgpbfg2646kp" w:id="189"/>
-      <w:bookmarkEnd w:id="189"/>
+        <w:rPr/>
+      </w:pPr>
+      <w:bookmarkStart w:colFirst="0" w:colLast="0" w:name="_rgpbfg2646kp" w:id="188"/>
+      <w:bookmarkEnd w:id="188"/>
       <w:r>
         <w:rPr>
           <w:b w:val="1"/>
@@ -20624,17 +20600,10 @@
         </w:rPr>
         <w:t xml:space="preserve">Sugar-free birthday, wedding and celebration cakes</w:t>
       </w:r>
-    </w:p>
-    <w:p>
-      <w:pPr>
-        <w:spacing w:after="240" w:before="240" w:lineRule="auto"/>
-        <w:rPr/>
-      </w:pPr>
-      <w:r>
-        <w:rPr>
-          <w:rtl w:val="0"/>
-        </w:rPr>
-        <w:t xml:space="preserve">A sugar-free cake can certainly still be the absolute centre of attention. This isn't just one token, plain sponge sitting at the end of a supermarket shelf. Our full custom design service applies across the entire reduced-sugar range:</w:t>
+      <w:r>
+        <w:rPr>
+          <w:rtl w:val="0"/>
+        </w:rPr>
       </w:r>
     </w:p>
     <w:p>
@@ -20787,233 +20756,253 @@
           <w:szCs w:val="26"/>
         </w:rPr>
       </w:pPr>
-      <w:bookmarkStart w:colFirst="0" w:colLast="0" w:name="_a8x503jamjw4" w:id="190"/>
+      <w:bookmarkStart w:colFirst="0" w:colLast="0" w:name="_a8x503jamjw4" w:id="189"/>
+      <w:bookmarkEnd w:id="189"/>
+      <w:r>
+        <w:rPr>
+          <w:b w:val="1"/>
+          <w:bCs w:val="1"/>
+          <w:color w:val="000000"/>
+          <w:sz w:val="26"/>
+          <w:szCs w:val="26"/>
+          <w:rtl w:val="0"/>
+        </w:rPr>
+        <w:t xml:space="preserve">Common questions about sugar-free cakes</w:t>
+      </w:r>
+    </w:p>
+    <w:p>
+      <w:pPr>
+        <w:spacing w:after="200" w:lineRule="auto"/>
+        <w:rPr>
+          <w:b w:val="1"/>
+          <w:bCs w:val="1"/>
+        </w:rPr>
+      </w:pPr>
+      <w:r>
+        <w:rPr>
+          <w:b w:val="1"/>
+          <w:bCs w:val="1"/>
+          <w:rtl w:val="0"/>
+        </w:rPr>
+        <w:t xml:space="preserve">Where in Melbourne can you deliver a sugar-free cake?</w:t>
+      </w:r>
+    </w:p>
+    <w:p>
+      <w:pPr>
+        <w:spacing w:after="200" w:lineRule="auto"/>
+        <w:rPr/>
+      </w:pPr>
+      <w:r>
+        <w:rPr>
+          <w:rtl w:val="0"/>
+        </w:rPr>
+        <w:t xml:space="preserve">Across the metro, the CBD and inner suburbs are included, with click &amp; collect from Keilor Park when time is short.</w:t>
+      </w:r>
+    </w:p>
+    <w:p>
+      <w:pPr>
+        <w:spacing w:after="200" w:lineRule="auto"/>
+        <w:rPr>
+          <w:b w:val="1"/>
+          <w:bCs w:val="1"/>
+        </w:rPr>
+      </w:pPr>
+      <w:r>
+        <w:rPr>
+          <w:b w:val="1"/>
+          <w:bCs w:val="1"/>
+          <w:rtl w:val="0"/>
+        </w:rPr>
+        <w:t xml:space="preserve">Can I order a birthday cake from the sugar-free range?</w:t>
+      </w:r>
+    </w:p>
+    <w:p>
+      <w:pPr>
+        <w:spacing w:after="200" w:lineRule="auto"/>
+        <w:rPr/>
+      </w:pPr>
+      <w:r>
+        <w:rPr>
+          <w:rtl w:val="0"/>
+        </w:rPr>
+        <w:t xml:space="preserve">Yes, and it is one of our most common requests, from character cakes to edible images, in your choice of flavour and size.</w:t>
+      </w:r>
+    </w:p>
+    <w:p>
+      <w:pPr>
+        <w:spacing w:after="200" w:lineRule="auto"/>
+        <w:rPr>
+          <w:b w:val="1"/>
+          <w:bCs w:val="1"/>
+        </w:rPr>
+      </w:pPr>
+      <w:r>
+        <w:rPr>
+          <w:b w:val="1"/>
+          <w:bCs w:val="1"/>
+          <w:rtl w:val="0"/>
+        </w:rPr>
+        <w:t xml:space="preserve">How is this different from a supermarket sugar-free cake?</w:t>
+      </w:r>
+    </w:p>
+    <w:p>
+      <w:pPr>
+        <w:spacing w:after="200" w:lineRule="auto"/>
+        <w:rPr/>
+      </w:pPr>
+      <w:r>
+        <w:rPr>
+          <w:rtl w:val="0"/>
+        </w:rPr>
+        <w:t xml:space="preserve">Ours is made to order and finished by hand, with the whole custom range baked without refined sugar instead of one fixed option.</w:t>
+      </w:r>
+    </w:p>
+    <w:p>
+      <w:pPr>
+        <w:spacing w:after="200" w:lineRule="auto"/>
+        <w:rPr/>
+      </w:pPr>
+      <w:r>
+        <w:rPr>
+          <w:rtl w:val="0"/>
+        </w:rPr>
+      </w:r>
+    </w:p>
+    <w:p>
+      <w:pPr>
+        <w:spacing w:after="200" w:lineRule="auto"/>
+        <w:rPr/>
+      </w:pPr>
+      <w:r>
+        <w:rPr>
+          <w:rtl w:val="0"/>
+        </w:rPr>
+      </w:r>
+    </w:p>
+    <w:p>
+      <w:pPr>
+        <w:spacing w:after="200" w:lineRule="auto"/>
+        <w:rPr/>
+      </w:pPr>
+      <w:r>
+        <w:rPr>
+          <w:rtl w:val="0"/>
+        </w:rPr>
+      </w:r>
+    </w:p>
+    <w:p>
+      <w:pPr>
+        <w:spacing w:after="200" w:lineRule="auto"/>
+        <w:rPr/>
+      </w:pPr>
+      <w:r>
+        <w:rPr>
+          <w:rtl w:val="0"/>
+        </w:rPr>
+      </w:r>
+    </w:p>
+    <w:p>
+      <w:pPr>
+        <w:spacing w:after="200" w:lineRule="auto"/>
+        <w:rPr/>
+      </w:pPr>
+      <w:r>
+        <w:rPr>
+          <w:rtl w:val="0"/>
+        </w:rPr>
+      </w:r>
+    </w:p>
+    <w:p>
+      <w:pPr>
+        <w:spacing w:after="200" w:lineRule="auto"/>
+        <w:rPr/>
+      </w:pPr>
+      <w:r>
+        <w:rPr>
+          <w:rtl w:val="0"/>
+        </w:rPr>
+      </w:r>
+    </w:p>
+    <w:p>
+      <w:pPr>
+        <w:spacing w:after="200" w:lineRule="auto"/>
+        <w:rPr/>
+      </w:pPr>
+      <w:r>
+        <w:rPr>
+          <w:rtl w:val="0"/>
+        </w:rPr>
+      </w:r>
+    </w:p>
+    <w:p>
+      <w:pPr>
+        <w:spacing w:after="200" w:lineRule="auto"/>
+        <w:rPr/>
+      </w:pPr>
+      <w:r>
+        <w:rPr>
+          <w:rtl w:val="0"/>
+        </w:rPr>
+      </w:r>
+    </w:p>
+    <w:p>
+      <w:pPr>
+        <w:spacing w:after="200" w:lineRule="auto"/>
+        <w:rPr/>
+      </w:pPr>
+      <w:r>
+        <w:rPr>
+          <w:rtl w:val="0"/>
+        </w:rPr>
+      </w:r>
+    </w:p>
+    <w:p>
+      <w:pPr>
+        <w:spacing w:after="200" w:lineRule="auto"/>
+        <w:rPr/>
+      </w:pPr>
+      <w:r>
+        <w:rPr>
+          <w:rtl w:val="0"/>
+        </w:rPr>
+      </w:r>
+    </w:p>
+    <w:p>
+      <w:pPr>
+        <w:spacing w:after="200" w:lineRule="auto"/>
+        <w:rPr/>
+      </w:pPr>
+      <w:r>
+        <w:rPr>
+          <w:rtl w:val="0"/>
+        </w:rPr>
+      </w:r>
+    </w:p>
+    <w:p>
+      <w:pPr>
+        <w:spacing w:after="200" w:lineRule="auto"/>
+        <w:rPr/>
+      </w:pPr>
+      <w:r>
+        <w:rPr>
+          <w:rtl w:val="0"/>
+        </w:rPr>
+      </w:r>
+    </w:p>
+    <w:p>
+      <w:pPr>
+        <w:pStyle w:val="Title"/>
+        <w:spacing w:after="200" w:lineRule="auto"/>
+        <w:rPr>
+          <w:b w:val="1"/>
+          <w:bCs w:val="1"/>
+        </w:rPr>
+      </w:pPr>
+      <w:bookmarkStart w:colFirst="0" w:colLast="0" w:name="_6yba0rspyj2y" w:id="190"/>
       <w:bookmarkEnd w:id="190"/>
       <w:r>
-        <w:rPr>
-          <w:b w:val="1"/>
-          <w:bCs w:val="1"/>
-          <w:color w:val="000000"/>
-          <w:sz w:val="26"/>
-          <w:szCs w:val="26"/>
-          <w:rtl w:val="0"/>
-        </w:rPr>
-        <w:t xml:space="preserve">Common questions about sugar-free cakes</w:t>
-      </w:r>
-    </w:p>
-    <w:p>
-      <w:pPr>
-        <w:spacing w:after="200" w:lineRule="auto"/>
-        <w:rPr>
-          <w:b w:val="1"/>
-          <w:bCs w:val="1"/>
-        </w:rPr>
-      </w:pPr>
-      <w:r>
-        <w:rPr>
-          <w:b w:val="1"/>
-          <w:bCs w:val="1"/>
-          <w:rtl w:val="0"/>
-        </w:rPr>
-        <w:t xml:space="preserve">Where in Melbourne can you deliver a sugar-free cake?</w:t>
-      </w:r>
-    </w:p>
-    <w:p>
-      <w:pPr>
-        <w:spacing w:after="200" w:lineRule="auto"/>
-        <w:rPr/>
-      </w:pPr>
-      <w:r>
-        <w:rPr>
-          <w:rtl w:val="0"/>
-        </w:rPr>
-        <w:t xml:space="preserve">Across the metro, the CBD and inner suburbs are included, with click &amp; collect from Keilor Park when time is short.</w:t>
-      </w:r>
-    </w:p>
-    <w:p>
-      <w:pPr>
-        <w:spacing w:after="200" w:lineRule="auto"/>
-        <w:rPr>
-          <w:b w:val="1"/>
-          <w:bCs w:val="1"/>
-        </w:rPr>
-      </w:pPr>
-      <w:r>
-        <w:rPr>
-          <w:b w:val="1"/>
-          <w:bCs w:val="1"/>
-          <w:rtl w:val="0"/>
-        </w:rPr>
-        <w:t xml:space="preserve">Can I order a birthday cake from the sugar-free range?</w:t>
-      </w:r>
-    </w:p>
-    <w:p>
-      <w:pPr>
-        <w:spacing w:after="200" w:lineRule="auto"/>
-        <w:rPr/>
-      </w:pPr>
-      <w:r>
-        <w:rPr>
-          <w:rtl w:val="0"/>
-        </w:rPr>
-        <w:t xml:space="preserve">Yes, and it is one of our most common requests, from character cakes to edible images, in your choice of flavour and size.</w:t>
-      </w:r>
-    </w:p>
-    <w:p>
-      <w:pPr>
-        <w:spacing w:after="200" w:lineRule="auto"/>
-        <w:rPr>
-          <w:b w:val="1"/>
-          <w:bCs w:val="1"/>
-        </w:rPr>
-      </w:pPr>
-      <w:r>
-        <w:rPr>
-          <w:b w:val="1"/>
-          <w:bCs w:val="1"/>
-          <w:rtl w:val="0"/>
-        </w:rPr>
-        <w:t xml:space="preserve">How is this different from a supermarket sugar-free cake?</w:t>
-      </w:r>
-    </w:p>
-    <w:p>
-      <w:pPr>
-        <w:spacing w:after="200" w:lineRule="auto"/>
-        <w:rPr/>
-      </w:pPr>
-      <w:r>
-        <w:rPr>
-          <w:rtl w:val="0"/>
-        </w:rPr>
-        <w:t xml:space="preserve">Ours is made to order and finished by hand, with the whole custom range baked without refined sugar instead of one fixed option.</w:t>
-      </w:r>
-    </w:p>
-    <w:p>
-      <w:pPr>
-        <w:spacing w:after="200" w:lineRule="auto"/>
-        <w:rPr/>
-      </w:pPr>
-      <w:r>
-        <w:rPr>
-          <w:rtl w:val="0"/>
-        </w:rPr>
-      </w:r>
-    </w:p>
-    <w:p>
-      <w:pPr>
-        <w:spacing w:after="200" w:lineRule="auto"/>
-        <w:rPr/>
-      </w:pPr>
-      <w:r>
-        <w:rPr>
-          <w:rtl w:val="0"/>
-        </w:rPr>
-      </w:r>
-    </w:p>
-    <w:p>
-      <w:pPr>
-        <w:spacing w:after="200" w:lineRule="auto"/>
-        <w:rPr/>
-      </w:pPr>
-      <w:r>
-        <w:rPr>
-          <w:rtl w:val="0"/>
-        </w:rPr>
-      </w:r>
-    </w:p>
-    <w:p>
-      <w:pPr>
-        <w:spacing w:after="200" w:lineRule="auto"/>
-        <w:rPr/>
-      </w:pPr>
-      <w:r>
-        <w:rPr>
-          <w:rtl w:val="0"/>
-        </w:rPr>
-      </w:r>
-    </w:p>
-    <w:p>
-      <w:pPr>
-        <w:spacing w:after="200" w:lineRule="auto"/>
-        <w:rPr/>
-      </w:pPr>
-      <w:r>
-        <w:rPr>
-          <w:rtl w:val="0"/>
-        </w:rPr>
-      </w:r>
-    </w:p>
-    <w:p>
-      <w:pPr>
-        <w:spacing w:after="200" w:lineRule="auto"/>
-        <w:rPr/>
-      </w:pPr>
-      <w:r>
-        <w:rPr>
-          <w:rtl w:val="0"/>
-        </w:rPr>
-      </w:r>
-    </w:p>
-    <w:p>
-      <w:pPr>
-        <w:spacing w:after="200" w:lineRule="auto"/>
-        <w:rPr/>
-      </w:pPr>
-      <w:r>
-        <w:rPr>
-          <w:rtl w:val="0"/>
-        </w:rPr>
-      </w:r>
-    </w:p>
-    <w:p>
-      <w:pPr>
-        <w:spacing w:after="200" w:lineRule="auto"/>
-        <w:rPr/>
-      </w:pPr>
-      <w:r>
-        <w:rPr>
-          <w:rtl w:val="0"/>
-        </w:rPr>
-      </w:r>
-    </w:p>
-    <w:p>
-      <w:pPr>
-        <w:spacing w:after="200" w:lineRule="auto"/>
-        <w:rPr/>
-      </w:pPr>
-      <w:r>
-        <w:rPr>
-          <w:rtl w:val="0"/>
-        </w:rPr>
-      </w:r>
-    </w:p>
-    <w:p>
-      <w:pPr>
-        <w:spacing w:after="200" w:lineRule="auto"/>
-        <w:rPr/>
-      </w:pPr>
-      <w:r>
-        <w:rPr>
-          <w:rtl w:val="0"/>
-        </w:rPr>
-      </w:r>
-    </w:p>
-    <w:p>
-      <w:pPr>
-        <w:spacing w:after="200" w:lineRule="auto"/>
-        <w:rPr/>
-      </w:pPr>
-      <w:r>
-        <w:rPr>
-          <w:rtl w:val="0"/>
-        </w:rPr>
-      </w:r>
-    </w:p>
-    <w:p>
-      <w:pPr>
-        <w:spacing w:after="200" w:lineRule="auto"/>
-        <w:rPr/>
-      </w:pPr>
+        <w:br w:type="page"/>
+      </w:r>
       <w:r>
         <w:rPr>
           <w:rtl w:val="0"/>
@@ -21029,28 +21018,8 @@
           <w:bCs w:val="1"/>
         </w:rPr>
       </w:pPr>
-      <w:bookmarkStart w:colFirst="0" w:colLast="0" w:name="_6yba0rspyj2y" w:id="191"/>
+      <w:bookmarkStart w:colFirst="0" w:colLast="0" w:name="_iyn90qv9hvyq" w:id="191"/>
       <w:bookmarkEnd w:id="191"/>
-      <w:r>
-        <w:br w:type="page"/>
-      </w:r>
-      <w:r>
-        <w:rPr>
-          <w:rtl w:val="0"/>
-        </w:rPr>
-      </w:r>
-    </w:p>
-    <w:p>
-      <w:pPr>
-        <w:pStyle w:val="Title"/>
-        <w:spacing w:after="200" w:lineRule="auto"/>
-        <w:rPr>
-          <w:b w:val="1"/>
-          <w:bCs w:val="1"/>
-        </w:rPr>
-      </w:pPr>
-      <w:bookmarkStart w:colFirst="0" w:colLast="0" w:name="_iyn90qv9hvyq" w:id="192"/>
-      <w:bookmarkEnd w:id="192"/>
       <w:r>
         <w:rPr>
           <w:b w:val="1"/>
@@ -21154,8 +21123,8 @@
         <w:spacing w:after="80" w:lineRule="auto"/>
         <w:rPr/>
       </w:pPr>
-      <w:bookmarkStart w:colFirst="0" w:colLast="0" w:name="_z1xfo0uij0vl" w:id="193"/>
-      <w:bookmarkEnd w:id="193"/>
+      <w:bookmarkStart w:colFirst="0" w:colLast="0" w:name="_z1xfo0uij0vl" w:id="192"/>
+      <w:bookmarkEnd w:id="192"/>
       <w:r>
         <w:rPr>
           <w:b w:val="1"/>
@@ -21253,8 +21222,8 @@
         <w:spacing w:before="280" w:lineRule="auto"/>
         <w:rPr/>
       </w:pPr>
-      <w:bookmarkStart w:colFirst="0" w:colLast="0" w:name="_p1vhzjaocvp" w:id="194"/>
-      <w:bookmarkEnd w:id="194"/>
+      <w:bookmarkStart w:colFirst="0" w:colLast="0" w:name="_p1vhzjaocvp" w:id="193"/>
+      <w:bookmarkEnd w:id="193"/>
       <w:r>
         <w:rPr>
           <w:b w:val="1"/>
@@ -21464,8 +21433,8 @@
         <w:spacing w:before="280" w:lineRule="auto"/>
         <w:rPr/>
       </w:pPr>
-      <w:bookmarkStart w:colFirst="0" w:colLast="0" w:name="_uel2x51u75a9" w:id="195"/>
-      <w:bookmarkEnd w:id="195"/>
+      <w:bookmarkStart w:colFirst="0" w:colLast="0" w:name="_uel2x51u75a9" w:id="194"/>
+      <w:bookmarkEnd w:id="194"/>
       <w:r>
         <w:rPr>
           <w:b w:val="1"/>
@@ -21544,8 +21513,8 @@
           <w:szCs w:val="26"/>
         </w:rPr>
       </w:pPr>
-      <w:bookmarkStart w:colFirst="0" w:colLast="0" w:name="_q9c79iuldfa6" w:id="196"/>
-      <w:bookmarkEnd w:id="196"/>
+      <w:bookmarkStart w:colFirst="0" w:colLast="0" w:name="_q9c79iuldfa6" w:id="195"/>
+      <w:bookmarkEnd w:id="195"/>
       <w:r>
         <w:rPr>
           <w:b w:val="1"/>
@@ -21619,8 +21588,8 @@
           <w:szCs w:val="26"/>
         </w:rPr>
       </w:pPr>
-      <w:bookmarkStart w:colFirst="0" w:colLast="0" w:name="_5vbog7fma0kd" w:id="197"/>
-      <w:bookmarkEnd w:id="197"/>
+      <w:bookmarkStart w:colFirst="0" w:colLast="0" w:name="_5vbog7fma0kd" w:id="196"/>
+      <w:bookmarkEnd w:id="196"/>
       <w:r>
         <w:rPr>
           <w:b w:val="1"/>
@@ -21817,8 +21786,8 @@
           <w:szCs w:val="26"/>
         </w:rPr>
       </w:pPr>
-      <w:bookmarkStart w:colFirst="0" w:colLast="0" w:name="_bm1va42dv4c9" w:id="198"/>
-      <w:bookmarkEnd w:id="198"/>
+      <w:bookmarkStart w:colFirst="0" w:colLast="0" w:name="_bm1va42dv4c9" w:id="197"/>
+      <w:bookmarkEnd w:id="197"/>
       <w:r>
         <w:rPr>
           <w:b w:val="1"/>
@@ -21898,8 +21867,8 @@
           <w:szCs w:val="26"/>
         </w:rPr>
       </w:pPr>
-      <w:bookmarkStart w:colFirst="0" w:colLast="0" w:name="_qxqkxharhsky" w:id="199"/>
-      <w:bookmarkEnd w:id="199"/>
+      <w:bookmarkStart w:colFirst="0" w:colLast="0" w:name="_qxqkxharhsky" w:id="198"/>
+      <w:bookmarkEnd w:id="198"/>
       <w:r>
         <w:rPr>
           <w:b w:val="1"/>
@@ -22013,8 +21982,8 @@
           <w:szCs w:val="26"/>
         </w:rPr>
       </w:pPr>
-      <w:bookmarkStart w:colFirst="0" w:colLast="0" w:name="_iperf4ca3p6u" w:id="200"/>
-      <w:bookmarkEnd w:id="200"/>
+      <w:bookmarkStart w:colFirst="0" w:colLast="0" w:name="_iperf4ca3p6u" w:id="199"/>
+      <w:bookmarkEnd w:id="199"/>
       <w:r>
         <w:rPr>
           <w:b w:val="1"/>
@@ -22081,8 +22050,8 @@
           <w:szCs w:val="46"/>
         </w:rPr>
       </w:pPr>
-      <w:bookmarkStart w:colFirst="0" w:colLast="0" w:name="_cntyfr9w3o0d" w:id="201"/>
-      <w:bookmarkEnd w:id="201"/>
+      <w:bookmarkStart w:colFirst="0" w:colLast="0" w:name="_cntyfr9w3o0d" w:id="200"/>
+      <w:bookmarkEnd w:id="200"/>
       <w:r>
         <w:br w:type="page"/>
       </w:r>
@@ -22105,8 +22074,8 @@
           <w:szCs w:val="46"/>
         </w:rPr>
       </w:pPr>
-      <w:bookmarkStart w:colFirst="0" w:colLast="0" w:name="_8l5jbdabjsqh" w:id="202"/>
-      <w:bookmarkEnd w:id="202"/>
+      <w:bookmarkStart w:colFirst="0" w:colLast="0" w:name="_8l5jbdabjsqh" w:id="201"/>
+      <w:bookmarkEnd w:id="201"/>
       <w:r>
         <w:rPr>
           <w:b w:val="1"/>
@@ -22215,8 +22184,8 @@
         <w:spacing w:after="80" w:lineRule="auto"/>
         <w:rPr/>
       </w:pPr>
-      <w:bookmarkStart w:colFirst="0" w:colLast="0" w:name="_e8dmb0iy3kj8" w:id="203"/>
-      <w:bookmarkEnd w:id="203"/>
+      <w:bookmarkStart w:colFirst="0" w:colLast="0" w:name="_e8dmb0iy3kj8" w:id="202"/>
+      <w:bookmarkEnd w:id="202"/>
       <w:r>
         <w:rPr>
           <w:b w:val="1"/>
@@ -22306,8 +22275,8 @@
           <w:szCs w:val="26"/>
         </w:rPr>
       </w:pPr>
-      <w:bookmarkStart w:colFirst="0" w:colLast="0" w:name="_sdcbv6ic57tf" w:id="204"/>
-      <w:bookmarkEnd w:id="204"/>
+      <w:bookmarkStart w:colFirst="0" w:colLast="0" w:name="_sdcbv6ic57tf" w:id="203"/>
+      <w:bookmarkEnd w:id="203"/>
       <w:r>
         <w:rPr>
           <w:b w:val="1"/>
@@ -22466,8 +22435,8 @@
           <w:szCs w:val="26"/>
         </w:rPr>
       </w:pPr>
-      <w:bookmarkStart w:colFirst="0" w:colLast="0" w:name="_q16mxcgeam0h" w:id="205"/>
-      <w:bookmarkEnd w:id="205"/>
+      <w:bookmarkStart w:colFirst="0" w:colLast="0" w:name="_q16mxcgeam0h" w:id="204"/>
+      <w:bookmarkEnd w:id="204"/>
       <w:r>
         <w:rPr>
           <w:b w:val="1"/>
@@ -22707,8 +22676,8 @@
           <w:szCs w:val="26"/>
         </w:rPr>
       </w:pPr>
-      <w:bookmarkStart w:colFirst="0" w:colLast="0" w:name="_s3e2zga5t19h" w:id="206"/>
-      <w:bookmarkEnd w:id="206"/>
+      <w:bookmarkStart w:colFirst="0" w:colLast="0" w:name="_s3e2zga5t19h" w:id="205"/>
+      <w:bookmarkEnd w:id="205"/>
       <w:r>
         <w:rPr>
           <w:b w:val="1"/>
@@ -22828,8 +22797,8 @@
           <w:szCs w:val="26"/>
         </w:rPr>
       </w:pPr>
-      <w:bookmarkStart w:colFirst="0" w:colLast="0" w:name="_dsw9fysksk0r" w:id="207"/>
-      <w:bookmarkEnd w:id="207"/>
+      <w:bookmarkStart w:colFirst="0" w:colLast="0" w:name="_dsw9fysksk0r" w:id="206"/>
+      <w:bookmarkEnd w:id="206"/>
       <w:r>
         <w:rPr>
           <w:b w:val="1"/>
@@ -22891,8 +22860,8 @@
           <w:szCs w:val="26"/>
         </w:rPr>
       </w:pPr>
-      <w:bookmarkStart w:colFirst="0" w:colLast="0" w:name="_lodnohkh1h86" w:id="208"/>
-      <w:bookmarkEnd w:id="208"/>
+      <w:bookmarkStart w:colFirst="0" w:colLast="0" w:name="_lodnohkh1h86" w:id="207"/>
+      <w:bookmarkEnd w:id="207"/>
       <w:r>
         <w:rPr>
           <w:b w:val="1"/>
@@ -23006,8 +22975,8 @@
           <w:szCs w:val="26"/>
         </w:rPr>
       </w:pPr>
-      <w:bookmarkStart w:colFirst="0" w:colLast="0" w:name="_kuxubxf4f5r1" w:id="209"/>
-      <w:bookmarkEnd w:id="209"/>
+      <w:bookmarkStart w:colFirst="0" w:colLast="0" w:name="_kuxubxf4f5r1" w:id="208"/>
+      <w:bookmarkEnd w:id="208"/>
       <w:r>
         <w:rPr>
           <w:b w:val="1"/>
@@ -23081,8 +23050,8 @@
           <w:szCs w:val="46"/>
         </w:rPr>
       </w:pPr>
-      <w:bookmarkStart w:colFirst="0" w:colLast="0" w:name="_ozlp649vi4qp" w:id="210"/>
-      <w:bookmarkEnd w:id="210"/>
+      <w:bookmarkStart w:colFirst="0" w:colLast="0" w:name="_ozlp649vi4qp" w:id="209"/>
+      <w:bookmarkEnd w:id="209"/>
       <w:r>
         <w:br w:type="page"/>
       </w:r>
@@ -23103,8 +23072,8 @@
           <w:bCs w:val="1"/>
         </w:rPr>
       </w:pPr>
-      <w:bookmarkStart w:colFirst="0" w:colLast="0" w:name="_yrguwflq6hce" w:id="211"/>
-      <w:bookmarkEnd w:id="211"/>
+      <w:bookmarkStart w:colFirst="0" w:colLast="0" w:name="_yrguwflq6hce" w:id="210"/>
+      <w:bookmarkEnd w:id="210"/>
       <w:r>
         <w:rPr>
           <w:b w:val="1"/>
@@ -23213,8 +23182,8 @@
           <w:szCs w:val="34"/>
         </w:rPr>
       </w:pPr>
-      <w:bookmarkStart w:colFirst="0" w:colLast="0" w:name="_wgkevprtpy5v" w:id="212"/>
-      <w:bookmarkEnd w:id="212"/>
+      <w:bookmarkStart w:colFirst="0" w:colLast="0" w:name="_wgkevprtpy5v" w:id="211"/>
+      <w:bookmarkEnd w:id="211"/>
       <w:r>
         <w:rPr>
           <w:b w:val="1"/>
@@ -23305,8 +23274,8 @@
           <w:szCs w:val="26"/>
         </w:rPr>
       </w:pPr>
-      <w:bookmarkStart w:colFirst="0" w:colLast="0" w:name="_5lmj7cwojy1f" w:id="213"/>
-      <w:bookmarkEnd w:id="213"/>
+      <w:bookmarkStart w:colFirst="0" w:colLast="0" w:name="_5lmj7cwojy1f" w:id="212"/>
+      <w:bookmarkEnd w:id="212"/>
       <w:r>
         <w:rPr>
           <w:b w:val="1"/>
@@ -23701,8 +23670,8 @@
           <w:szCs w:val="26"/>
         </w:rPr>
       </w:pPr>
-      <w:bookmarkStart w:colFirst="0" w:colLast="0" w:name="_1quo1ol3rqhp" w:id="214"/>
-      <w:bookmarkEnd w:id="214"/>
+      <w:bookmarkStart w:colFirst="0" w:colLast="0" w:name="_1quo1ol3rqhp" w:id="213"/>
+      <w:bookmarkEnd w:id="213"/>
       <w:r>
         <w:rPr>
           <w:b w:val="1"/>
@@ -23776,8 +23745,8 @@
           <w:szCs w:val="26"/>
         </w:rPr>
       </w:pPr>
-      <w:bookmarkStart w:colFirst="0" w:colLast="0" w:name="_x86tx196tlca" w:id="215"/>
-      <w:bookmarkEnd w:id="215"/>
+      <w:bookmarkStart w:colFirst="0" w:colLast="0" w:name="_x86tx196tlca" w:id="214"/>
+      <w:bookmarkEnd w:id="214"/>
       <w:r>
         <w:rPr>
           <w:b w:val="1"/>
@@ -23851,8 +23820,8 @@
           <w:szCs w:val="26"/>
         </w:rPr>
       </w:pPr>
-      <w:bookmarkStart w:colFirst="0" w:colLast="0" w:name="_8ly7rvgypef2" w:id="216"/>
-      <w:bookmarkEnd w:id="216"/>
+      <w:bookmarkStart w:colFirst="0" w:colLast="0" w:name="_8ly7rvgypef2" w:id="215"/>
+      <w:bookmarkEnd w:id="215"/>
       <w:r>
         <w:rPr>
           <w:b w:val="1"/>
@@ -23874,7 +23843,7 @@
         <w:rPr>
           <w:rtl w:val="0"/>
         </w:rPr>
-        <w:t xml:space="preserve">There is no separate menu here. At The Cake People, every single cake we bake is 100% plant-based, meaning egg-free and dairy-free come completely standard, with nut-free and soy-free recipes also available.</w:t>
+        <w:t xml:space="preserve">There is no separate menu here. At The Cake People, every single cake we bake is 100% plant-based, meaning egg-free and dairy-free come completely standard.</w:t>
       </w:r>
     </w:p>
     <w:p>
@@ -23926,8 +23895,8 @@
           <w:szCs w:val="26"/>
         </w:rPr>
       </w:pPr>
-      <w:bookmarkStart w:colFirst="0" w:colLast="0" w:name="_92jamxjs6nls" w:id="217"/>
-      <w:bookmarkEnd w:id="217"/>
+      <w:bookmarkStart w:colFirst="0" w:colLast="0" w:name="_92jamxjs6nls" w:id="216"/>
+      <w:bookmarkEnd w:id="216"/>
       <w:r>
         <w:rPr>
           <w:b w:val="1"/>
@@ -24098,8 +24067,8 @@
           <w:szCs w:val="46"/>
         </w:rPr>
       </w:pPr>
-      <w:bookmarkStart w:colFirst="0" w:colLast="0" w:name="_2mfdcwdl77yf" w:id="218"/>
-      <w:bookmarkEnd w:id="218"/>
+      <w:bookmarkStart w:colFirst="0" w:colLast="0" w:name="_2mfdcwdl77yf" w:id="217"/>
+      <w:bookmarkEnd w:id="217"/>
       <w:r>
         <w:br w:type="page"/>
       </w:r>
@@ -24120,8 +24089,8 @@
           <w:bCs w:val="1"/>
         </w:rPr>
       </w:pPr>
-      <w:bookmarkStart w:colFirst="0" w:colLast="0" w:name="_xqsdvf6aeaq3" w:id="219"/>
-      <w:bookmarkEnd w:id="219"/>
+      <w:bookmarkStart w:colFirst="0" w:colLast="0" w:name="_xqsdvf6aeaq3" w:id="218"/>
+      <w:bookmarkEnd w:id="218"/>
       <w:r>
         <w:rPr>
           <w:b w:val="1"/>
@@ -24230,8 +24199,8 @@
           <w:szCs w:val="34"/>
         </w:rPr>
       </w:pPr>
-      <w:bookmarkStart w:colFirst="0" w:colLast="0" w:name="_u9k9yleavjdz" w:id="220"/>
-      <w:bookmarkEnd w:id="220"/>
+      <w:bookmarkStart w:colFirst="0" w:colLast="0" w:name="_u9k9yleavjdz" w:id="219"/>
+      <w:bookmarkEnd w:id="219"/>
       <w:r>
         <w:rPr>
           <w:b w:val="1"/>
@@ -24315,8 +24284,8 @@
         <w:spacing w:before="280" w:lineRule="auto"/>
         <w:rPr/>
       </w:pPr>
-      <w:bookmarkStart w:colFirst="0" w:colLast="0" w:name="_hn5y1lrug3va" w:id="221"/>
-      <w:bookmarkEnd w:id="221"/>
+      <w:bookmarkStart w:colFirst="0" w:colLast="0" w:name="_hn5y1lrug3va" w:id="220"/>
+      <w:bookmarkEnd w:id="220"/>
       <w:r>
         <w:rPr>
           <w:b w:val="1"/>
@@ -24401,8 +24370,8 @@
           <w:szCs w:val="26"/>
         </w:rPr>
       </w:pPr>
-      <w:bookmarkStart w:colFirst="0" w:colLast="0" w:name="_o5x647h4f90q" w:id="222"/>
-      <w:bookmarkEnd w:id="222"/>
+      <w:bookmarkStart w:colFirst="0" w:colLast="0" w:name="_o5x647h4f90q" w:id="221"/>
+      <w:bookmarkEnd w:id="221"/>
       <w:r>
         <w:rPr>
           <w:b w:val="1"/>
@@ -24624,8 +24593,8 @@
           <w:szCs w:val="26"/>
         </w:rPr>
       </w:pPr>
-      <w:bookmarkStart w:colFirst="0" w:colLast="0" w:name="_svesv08q0woq" w:id="223"/>
-      <w:bookmarkEnd w:id="223"/>
+      <w:bookmarkStart w:colFirst="0" w:colLast="0" w:name="_svesv08q0woq" w:id="222"/>
+      <w:bookmarkEnd w:id="222"/>
       <w:r>
         <w:rPr>
           <w:b w:val="1"/>
@@ -24745,8 +24714,8 @@
           <w:szCs w:val="26"/>
         </w:rPr>
       </w:pPr>
-      <w:bookmarkStart w:colFirst="0" w:colLast="0" w:name="_xq247c65pe58" w:id="224"/>
-      <w:bookmarkEnd w:id="224"/>
+      <w:bookmarkStart w:colFirst="0" w:colLast="0" w:name="_xq247c65pe58" w:id="223"/>
+      <w:bookmarkEnd w:id="223"/>
       <w:r>
         <w:rPr>
           <w:b w:val="1"/>

</xml_diff>